<commit_message>
Interview scripts: questions in the interviewer's voice
Questions now open by placing what we know ("according to the sources we
consulted", "we understand that", "we noticed that") and ask for the
respondent's account and assessment ("how would you describe", "what is your
overall assessment"), on the model the team set for New South Wales. The 60 per
cent figure is attributed to the NSW Government media release of 8 May 2024.

Co-Authored-By: Claude Fable 5.1 <noreply@anthropic.com>
Claude-Session: https://claude.ai/code/session_01REVwghctKjYh8VQ919ThdA
</commit_message>
<xml_diff>
--- a/policies/interviews/Interview_scripts.docx
+++ b/policies/interviews/Interview_scripts.docx
@@ -228,7 +228,7 @@
           <w:sz w:val="24"/>
           <w:szCs w:val="24"/>
         </w:rPr>
-        <w:t xml:space="preserve"> the School Workforce directorate of the NSW Department of Education, which handles attraction, retention and the placement of teachers in public schools.</w:t>
+        <w:t xml:space="preserve"> the School Workforce directorate of the NSW Department of Education.</w:t>
       </w:r>
     </w:p>
     <w:p>
@@ -283,44 +283,18 @@
           <w:sz w:val="24"/>
           <w:szCs w:val="24"/>
         </w:rPr>
-        <w:t xml:space="preserve">How did this start?</w:t>
-      </w:r>
-      <w:r>
-        <w:rPr>
-          <w:rFonts w:ascii="Garamond" w:cs="Garamond" w:eastAsia="Garamond" w:hAnsi="Garamond"/>
-          <w:b w:val="false"/>
-          <w:bCs w:val="false"/>
-          <w:color w:val="000000"/>
-          <w:sz w:val="24"/>
-          <w:szCs w:val="24"/>
-        </w:rPr>
-        <w:t xml:space="preserve"> Who first proposed going back to teachers who had already left, and who had to agree?</w:t>
-      </w:r>
-    </w:p>
-    <w:p>
-      <w:pPr>
-        <w:spacing w:after="40" w:before="0"/>
-        <w:ind w:left="1008" w:hanging="288"/>
-      </w:pPr>
-      <w:r>
-        <w:rPr>
-          <w:rFonts w:ascii="Garamond" w:cs="Garamond" w:eastAsia="Garamond" w:hAnsi="Garamond"/>
-          <w:color w:val="555555"/>
-          <w:sz w:val="21"/>
-          <w:szCs w:val="21"/>
-        </w:rPr>
-        <w:t xml:space="preserve">–	</w:t>
-      </w:r>
-      <w:r>
-        <w:rPr>
-          <w:rFonts w:ascii="Garamond" w:cs="Garamond" w:eastAsia="Garamond" w:hAnsi="Garamond"/>
-          <w:b w:val="false"/>
-          <w:bCs w:val="false"/>
-          <w:color w:val="555555"/>
-          <w:sz w:val="21"/>
-          <w:szCs w:val="21"/>
-        </w:rPr>
-        <w:t xml:space="preserve">Was there a model, in Australia or elsewhere?</w:t>
+        <w:t xml:space="preserve">In what context did this initiative come about, and with what purpose?</w:t>
+      </w:r>
+      <w:r>
+        <w:rPr>
+          <w:rFonts w:ascii="Garamond" w:cs="Garamond" w:eastAsia="Garamond" w:hAnsi="Garamond"/>
+          <w:b w:val="false"/>
+          <w:bCs w:val="false"/>
+          <w:color w:val="000000"/>
+          <w:sz w:val="24"/>
+          <w:szCs w:val="24"/>
+        </w:rPr>
+        <w:t xml:space="preserve"> Was the teacher shortage severe at the time?</w:t>
       </w:r>
     </w:p>
     <w:p>
@@ -454,7 +428,7 @@
           <w:sz w:val="24"/>
           <w:szCs w:val="24"/>
         </w:rPr>
-        <w:t xml:space="preserve">What did they answer?</w:t>
+        <w:t xml:space="preserve">How would you describe the response you got?</w:t>
       </w:r>
       <w:r>
         <w:rPr>
@@ -519,33 +493,33 @@
           <w:sz w:val="24"/>
           <w:szCs w:val="24"/>
         </w:rPr>
-        <w:t xml:space="preserve">Once someone said yes, what followed, and where did it stall?</w:t>
-      </w:r>
-    </w:p>
-    <w:p>
-      <w:pPr>
-        <w:spacing w:after="40" w:before="0"/>
-        <w:ind w:left="1008" w:hanging="288"/>
-      </w:pPr>
-      <w:r>
-        <w:rPr>
-          <w:rFonts w:ascii="Garamond" w:cs="Garamond" w:eastAsia="Garamond" w:hAnsi="Garamond"/>
-          <w:color w:val="555555"/>
-          <w:sz w:val="21"/>
-          <w:szCs w:val="21"/>
-        </w:rPr>
-        <w:t xml:space="preserve">–	</w:t>
-      </w:r>
-      <w:r>
-        <w:rPr>
-          <w:rFonts w:ascii="Garamond" w:cs="Garamond" w:eastAsia="Garamond" w:hAnsi="Garamond"/>
-          <w:b w:val="false"/>
-          <w:bCs w:val="false"/>
-          <w:color w:val="555555"/>
-          <w:sz w:val="21"/>
-          <w:szCs w:val="21"/>
-        </w:rPr>
-        <w:t xml:space="preserve">The standards authority opened a shorter re-accreditation route for retired teachers the same month. Was that planned together?</w:t>
+        <w:t xml:space="preserve">We understand the programme offered help with re-accreditation and a placement in casual or temporary work. What did that help consist of in practice?</w:t>
+      </w:r>
+    </w:p>
+    <w:p>
+      <w:pPr>
+        <w:spacing w:after="40" w:before="0"/>
+        <w:ind w:left="1008" w:hanging="288"/>
+      </w:pPr>
+      <w:r>
+        <w:rPr>
+          <w:rFonts w:ascii="Garamond" w:cs="Garamond" w:eastAsia="Garamond" w:hAnsi="Garamond"/>
+          <w:color w:val="555555"/>
+          <w:sz w:val="21"/>
+          <w:szCs w:val="21"/>
+        </w:rPr>
+        <w:t xml:space="preserve">–	</w:t>
+      </w:r>
+      <w:r>
+        <w:rPr>
+          <w:rFonts w:ascii="Garamond" w:cs="Garamond" w:eastAsia="Garamond" w:hAnsi="Garamond"/>
+          <w:b w:val="false"/>
+          <w:bCs w:val="false"/>
+          <w:color w:val="555555"/>
+          <w:sz w:val="21"/>
+          <w:szCs w:val="21"/>
+        </w:rPr>
+        <w:t xml:space="preserve">The standards authority opened a shorter route for retired teachers the same month. Was that planned together?</w:t>
       </w:r>
     </w:p>
     <w:p>
@@ -599,33 +573,61 @@
           <w:sz w:val="24"/>
           <w:szCs w:val="24"/>
         </w:rPr>
-        <w:t xml:space="preserve">Who came back, and to what kind of post?</w:t>
-      </w:r>
-    </w:p>
-    <w:p>
-      <w:pPr>
-        <w:spacing w:after="40" w:before="0"/>
-        <w:ind w:left="1008" w:hanging="288"/>
-      </w:pPr>
-      <w:r>
-        <w:rPr>
-          <w:rFonts w:ascii="Garamond" w:cs="Garamond" w:eastAsia="Garamond" w:hAnsi="Garamond"/>
-          <w:color w:val="555555"/>
-          <w:sz w:val="21"/>
-          <w:szCs w:val="21"/>
-        </w:rPr>
-        <w:t xml:space="preserve">–	</w:t>
-      </w:r>
-      <w:r>
-        <w:rPr>
-          <w:rFonts w:ascii="Garamond" w:cs="Garamond" w:eastAsia="Garamond" w:hAnsi="Garamond"/>
-          <w:b w:val="false"/>
-          <w:bCs w:val="false"/>
-          <w:color w:val="555555"/>
-          <w:sz w:val="21"/>
-          <w:szCs w:val="21"/>
-        </w:rPr>
-        <w:t xml:space="preserve">Casual, temporary, permanent: did what they wanted match what schools needed?</w:t>
+        <w:t xml:space="preserve">According to the sources we consulted, the initiative was launched right after a large pay rise and a cut in teachers' administrative workload. How much of the result do you attribute to the outreach itself, and how much to that?</w:t>
+      </w:r>
+    </w:p>
+    <w:p>
+      <w:pPr>
+        <w:spacing w:after="60" w:before="200"/>
+        <w:ind w:left="504" w:hanging="504"/>
+      </w:pPr>
+      <w:r>
+        <w:rPr>
+          <w:rFonts w:ascii="Garamond" w:cs="Garamond" w:eastAsia="Garamond" w:hAnsi="Garamond"/>
+          <w:b/>
+          <w:bCs/>
+          <w:color w:val="000000"/>
+          <w:sz w:val="24"/>
+          <w:szCs w:val="24"/>
+        </w:rPr>
+        <w:t xml:space="preserve">6.	</w:t>
+      </w:r>
+      <w:r>
+        <w:rPr>
+          <w:rFonts w:ascii="Garamond" w:cs="Garamond" w:eastAsia="Garamond" w:hAnsi="Garamond"/>
+          <w:b/>
+          <w:bCs/>
+          <w:color w:val="000000"/>
+          <w:sz w:val="24"/>
+          <w:szCs w:val="24"/>
+        </w:rPr>
+        <w:t xml:space="preserve">The Department's media release of May 2024 says about 60 per cent of those who came back were retired. Is that right, and if so, why did they come back?</w:t>
+      </w:r>
+    </w:p>
+    <w:p>
+      <w:pPr>
+        <w:spacing w:after="40" w:before="0"/>
+        <w:ind w:left="1008" w:hanging="288"/>
+      </w:pPr>
+      <w:r>
+        <w:rPr>
+          <w:rFonts w:ascii="Garamond" w:cs="Garamond" w:eastAsia="Garamond" w:hAnsi="Garamond"/>
+          <w:color w:val="555555"/>
+          <w:sz w:val="21"/>
+          <w:szCs w:val="21"/>
+        </w:rPr>
+        <w:t xml:space="preserve">–	</w:t>
+      </w:r>
+      <w:r>
+        <w:rPr>
+          <w:rFonts w:ascii="Garamond" w:cs="Garamond" w:eastAsia="Garamond" w:hAnsi="Garamond"/>
+          <w:b w:val="false"/>
+          <w:bCs w:val="false"/>
+          <w:color w:val="555555"/>
+          <w:sz w:val="21"/>
+          <w:szCs w:val="21"/>
+        </w:rPr>
+        <w:t xml:space="preserve">And the other 40 per cent: who were they, and what had they been doing?</w:t>
       </w:r>
     </w:p>
     <w:p>
@@ -668,34 +670,6 @@
           <w:sz w:val="24"/>
           <w:szCs w:val="24"/>
         </w:rPr>
-        <w:t xml:space="preserve">6.	</w:t>
-      </w:r>
-      <w:r>
-        <w:rPr>
-          <w:rFonts w:ascii="Garamond" w:cs="Garamond" w:eastAsia="Garamond" w:hAnsi="Garamond"/>
-          <w:b/>
-          <w:bCs/>
-          <w:color w:val="000000"/>
-          <w:sz w:val="24"/>
-          <w:szCs w:val="24"/>
-        </w:rPr>
-        <w:t xml:space="preserve">The pay rise and the reduction in administrative work came in at the same time. How much of the result do you attribute to the outreach itself?</w:t>
-      </w:r>
-    </w:p>
-    <w:p>
-      <w:pPr>
-        <w:spacing w:after="60" w:before="200"/>
-        <w:ind w:left="504" w:hanging="504"/>
-      </w:pPr>
-      <w:r>
-        <w:rPr>
-          <w:rFonts w:ascii="Garamond" w:cs="Garamond" w:eastAsia="Garamond" w:hAnsi="Garamond"/>
-          <w:b/>
-          <w:bCs/>
-          <w:color w:val="000000"/>
-          <w:sz w:val="24"/>
-          <w:szCs w:val="24"/>
-        </w:rPr>
         <w:t xml:space="preserve">7.	</w:t>
       </w:r>
       <w:r>
@@ -707,44 +681,59 @@
           <w:sz w:val="24"/>
           <w:szCs w:val="24"/>
         </w:rPr>
-        <w:t xml:space="preserve">Are the teachers who came back the same kind of teachers who leave?</w:t>
-      </w:r>
-      <w:r>
-        <w:rPr>
-          <w:rFonts w:ascii="Garamond" w:cs="Garamond" w:eastAsia="Garamond" w:hAnsi="Garamond"/>
-          <w:b w:val="false"/>
-          <w:bCs w:val="false"/>
-          <w:color w:val="000000"/>
-          <w:sz w:val="24"/>
-          <w:szCs w:val="24"/>
-        </w:rPr>
-        <w:t xml:space="preserve"> What did they say about why they had left, and what had changed?</w:t>
-      </w:r>
-    </w:p>
-    <w:p>
-      <w:pPr>
-        <w:spacing w:after="40" w:before="0"/>
-        <w:ind w:left="1008" w:hanging="288"/>
-      </w:pPr>
-      <w:r>
-        <w:rPr>
-          <w:rFonts w:ascii="Garamond" w:cs="Garamond" w:eastAsia="Garamond" w:hAnsi="Garamond"/>
-          <w:color w:val="555555"/>
-          <w:sz w:val="21"/>
-          <w:szCs w:val="21"/>
-        </w:rPr>
-        <w:t xml:space="preserve">–	</w:t>
-      </w:r>
-      <w:r>
-        <w:rPr>
-          <w:rFonts w:ascii="Garamond" w:cs="Garamond" w:eastAsia="Garamond" w:hAnsi="Garamond"/>
-          <w:b w:val="false"/>
-          <w:bCs w:val="false"/>
-          <w:color w:val="555555"/>
-          <w:sz w:val="21"/>
-          <w:szCs w:val="21"/>
-        </w:rPr>
-        <w:t xml:space="preserve">Is there a kind of leaver this approach does not reach?</w:t>
+        <w:t xml:space="preserve">Is there any record of how well the policy has worked — an internal evaluation, figures after May 2024?</w:t>
+      </w:r>
+    </w:p>
+    <w:p>
+      <w:pPr>
+        <w:spacing w:after="40" w:before="0"/>
+        <w:ind w:left="1008" w:hanging="288"/>
+      </w:pPr>
+      <w:r>
+        <w:rPr>
+          <w:rFonts w:ascii="Garamond" w:cs="Garamond" w:eastAsia="Garamond" w:hAnsi="Garamond"/>
+          <w:color w:val="555555"/>
+          <w:sz w:val="21"/>
+          <w:szCs w:val="21"/>
+        </w:rPr>
+        <w:t xml:space="preserve">–	</w:t>
+      </w:r>
+      <w:r>
+        <w:rPr>
+          <w:rFonts w:ascii="Garamond" w:cs="Garamond" w:eastAsia="Garamond" w:hAnsi="Garamond"/>
+          <w:b w:val="false"/>
+          <w:bCs w:val="false"/>
+          <w:color w:val="555555"/>
+          <w:sz w:val="21"/>
+          <w:szCs w:val="21"/>
+        </w:rPr>
+        <w:t xml:space="preserve">How many were still teaching a year later? Any permanent appointments?</w:t>
+      </w:r>
+    </w:p>
+    <w:p>
+      <w:pPr>
+        <w:spacing w:after="40" w:before="0"/>
+        <w:ind w:left="1008" w:hanging="288"/>
+      </w:pPr>
+      <w:r>
+        <w:rPr>
+          <w:rFonts w:ascii="Garamond" w:cs="Garamond" w:eastAsia="Garamond" w:hAnsi="Garamond"/>
+          <w:color w:val="555555"/>
+          <w:sz w:val="21"/>
+          <w:szCs w:val="21"/>
+        </w:rPr>
+        <w:t xml:space="preserve">–	</w:t>
+      </w:r>
+      <w:r>
+        <w:rPr>
+          <w:rFonts w:ascii="Garamond" w:cs="Garamond" w:eastAsia="Garamond" w:hAnsi="Garamond"/>
+          <w:b w:val="false"/>
+          <w:bCs w:val="false"/>
+          <w:color w:val="555555"/>
+          <w:sz w:val="21"/>
+          <w:szCs w:val="21"/>
+        </w:rPr>
+        <w:t xml:space="preserve">Is the initiative still running?</w:t>
       </w:r>
     </w:p>
     <w:p>
@@ -772,59 +761,7 @@
           <w:sz w:val="24"/>
           <w:szCs w:val="24"/>
         </w:rPr>
-        <w:t xml:space="preserve">What became of them, and what did the exercise teach you?</w:t>
-      </w:r>
-    </w:p>
-    <w:p>
-      <w:pPr>
-        <w:spacing w:after="40" w:before="0"/>
-        <w:ind w:left="1008" w:hanging="288"/>
-      </w:pPr>
-      <w:r>
-        <w:rPr>
-          <w:rFonts w:ascii="Garamond" w:cs="Garamond" w:eastAsia="Garamond" w:hAnsi="Garamond"/>
-          <w:color w:val="555555"/>
-          <w:sz w:val="21"/>
-          <w:szCs w:val="21"/>
-        </w:rPr>
-        <w:t xml:space="preserve">–	</w:t>
-      </w:r>
-      <w:r>
-        <w:rPr>
-          <w:rFonts w:ascii="Garamond" w:cs="Garamond" w:eastAsia="Garamond" w:hAnsi="Garamond"/>
-          <w:b w:val="false"/>
-          <w:bCs w:val="false"/>
-          <w:color w:val="555555"/>
-          <w:sz w:val="21"/>
-          <w:szCs w:val="21"/>
-        </w:rPr>
-        <w:t xml:space="preserve">How many were still teaching a year later? Any permanent appointments?</w:t>
-      </w:r>
-    </w:p>
-    <w:p>
-      <w:pPr>
-        <w:spacing w:after="40" w:before="0"/>
-        <w:ind w:left="1008" w:hanging="288"/>
-      </w:pPr>
-      <w:r>
-        <w:rPr>
-          <w:rFonts w:ascii="Garamond" w:cs="Garamond" w:eastAsia="Garamond" w:hAnsi="Garamond"/>
-          <w:color w:val="555555"/>
-          <w:sz w:val="21"/>
-          <w:szCs w:val="21"/>
-        </w:rPr>
-        <w:t xml:space="preserve">–	</w:t>
-      </w:r>
-      <w:r>
-        <w:rPr>
-          <w:rFonts w:ascii="Garamond" w:cs="Garamond" w:eastAsia="Garamond" w:hAnsi="Garamond"/>
-          <w:b w:val="false"/>
-          <w:bCs w:val="false"/>
-          <w:color w:val="555555"/>
-          <w:sz w:val="21"/>
-          <w:szCs w:val="21"/>
-        </w:rPr>
-        <w:t xml:space="preserve">Was it reviewed? Is it still running? What would you change?</w:t>
+        <w:t xml:space="preserve">Overall, what is your assessment of its impact, and what has it taught you?</w:t>
       </w:r>
     </w:p>
     <w:p>
@@ -852,7 +789,7 @@
           <w:sz w:val="24"/>
           <w:szCs w:val="24"/>
         </w:rPr>
-        <w:t xml:space="preserve">Is there someone else, in the Department or at the standards authority, we should speak to?</w:t>
+        <w:t xml:space="preserve">Is there someone else, in the Department or at the standards authority, you would recommend we speak to?</w:t>
       </w:r>
     </w:p>
     <w:p>
@@ -919,7 +856,7 @@
           <w:sz w:val="24"/>
           <w:szCs w:val="24"/>
         </w:rPr>
-        <w:t xml:space="preserve"> the re-engagement team of the Department of Education, in the area responsible for attracting teachers to government schools.</w:t>
+        <w:t xml:space="preserve"> the re-engagement team of the Victorian Department of Education.</w:t>
       </w:r>
     </w:p>
     <w:p>
@@ -974,18 +911,18 @@
           <w:sz w:val="24"/>
           <w:szCs w:val="24"/>
         </w:rPr>
-        <w:t xml:space="preserve">How did this start?</w:t>
-      </w:r>
-      <w:r>
-        <w:rPr>
-          <w:rFonts w:ascii="Garamond" w:cs="Garamond" w:eastAsia="Garamond" w:hAnsi="Garamond"/>
-          <w:b w:val="false"/>
-          <w:bCs w:val="false"/>
-          <w:color w:val="000000"/>
-          <w:sz w:val="24"/>
-          <w:szCs w:val="24"/>
-        </w:rPr>
-        <w:t xml:space="preserve"> The expressions of interest came before the money, which is the reverse of the usual order.</w:t>
+        <w:t xml:space="preserve">In what context did this initiative come about, and with what purpose?</w:t>
+      </w:r>
+      <w:r>
+        <w:rPr>
+          <w:rFonts w:ascii="Garamond" w:cs="Garamond" w:eastAsia="Garamond" w:hAnsi="Garamond"/>
+          <w:b w:val="false"/>
+          <w:bCs w:val="false"/>
+          <w:color w:val="000000"/>
+          <w:sz w:val="24"/>
+          <w:szCs w:val="24"/>
+        </w:rPr>
+        <w:t xml:space="preserve"> We understand the expressions of interest came before the funding.</w:t>
       </w:r>
     </w:p>
     <w:p>
@@ -1016,32 +953,6 @@
     </w:p>
     <w:p>
       <w:pPr>
-        <w:spacing w:after="40" w:before="0"/>
-        <w:ind w:left="1008" w:hanging="288"/>
-      </w:pPr>
-      <w:r>
-        <w:rPr>
-          <w:rFonts w:ascii="Garamond" w:cs="Garamond" w:eastAsia="Garamond" w:hAnsi="Garamond"/>
-          <w:color w:val="555555"/>
-          <w:sz w:val="21"/>
-          <w:szCs w:val="21"/>
-        </w:rPr>
-        <w:t xml:space="preserve">–	</w:t>
-      </w:r>
-      <w:r>
-        <w:rPr>
-          <w:rFonts w:ascii="Garamond" w:cs="Garamond" w:eastAsia="Garamond" w:hAnsi="Garamond"/>
-          <w:b w:val="false"/>
-          <w:bCs w:val="false"/>
-          <w:color w:val="555555"/>
-          <w:sz w:val="21"/>
-          <w:szCs w:val="21"/>
-        </w:rPr>
-        <w:t xml:space="preserve">What else was considered?</w:t>
-      </w:r>
-    </w:p>
-    <w:p>
-      <w:pPr>
         <w:spacing w:after="60" w:before="200"/>
         <w:ind w:left="504" w:hanging="504"/>
       </w:pPr>
@@ -1065,7 +976,7 @@
           <w:sz w:val="24"/>
           <w:szCs w:val="24"/>
         </w:rPr>
-        <w:t xml:space="preserve">From registration to the first day in a school, what happens?</w:t>
+        <w:t xml:space="preserve">How would you describe what happens between a teacher registering and their first day in a school?</w:t>
       </w:r>
     </w:p>
     <w:p>
@@ -1225,7 +1136,7 @@
           <w:sz w:val="24"/>
           <w:szCs w:val="24"/>
         </w:rPr>
-        <w:t xml:space="preserve">The placement is now described as funded by the school rather than centrally. Is that right, and how did it come about?</w:t>
+        <w:t xml:space="preserve">According to the current departmental pages, the placement is now funded by the school rather than centrally. Is that right, and how did that change come about?</w:t>
       </w:r>
     </w:p>
     <w:p>
@@ -1359,18 +1270,7 @@
           <w:sz w:val="24"/>
           <w:szCs w:val="24"/>
         </w:rPr>
-        <w:t xml:space="preserve">Are the teachers who came back the same kind of teachers who leave?</w:t>
-      </w:r>
-      <w:r>
-        <w:rPr>
-          <w:rFonts w:ascii="Garamond" w:cs="Garamond" w:eastAsia="Garamond" w:hAnsi="Garamond"/>
-          <w:b w:val="false"/>
-          <w:bCs w:val="false"/>
-          <w:color w:val="000000"/>
-          <w:sz w:val="24"/>
-          <w:szCs w:val="24"/>
-        </w:rPr>
-        <w:t xml:space="preserve"> What did they say about why they had left, and what worried them about returning?</w:t>
+        <w:t xml:space="preserve">We noticed that more than 1,100 teachers registered interest in the first months. What did they tell you about why they had left, and what worried them about coming back?</w:t>
       </w:r>
     </w:p>
     <w:p>
@@ -1424,59 +1324,59 @@
           <w:sz w:val="24"/>
           <w:szCs w:val="24"/>
         </w:rPr>
-        <w:t xml:space="preserve">What happened after the placements?</w:t>
-      </w:r>
-    </w:p>
-    <w:p>
-      <w:pPr>
-        <w:spacing w:after="40" w:before="0"/>
-        <w:ind w:left="1008" w:hanging="288"/>
-      </w:pPr>
-      <w:r>
-        <w:rPr>
-          <w:rFonts w:ascii="Garamond" w:cs="Garamond" w:eastAsia="Garamond" w:hAnsi="Garamond"/>
-          <w:color w:val="555555"/>
-          <w:sz w:val="21"/>
-          <w:szCs w:val="21"/>
-        </w:rPr>
-        <w:t xml:space="preserve">–	</w:t>
-      </w:r>
-      <w:r>
-        <w:rPr>
-          <w:rFonts w:ascii="Garamond" w:cs="Garamond" w:eastAsia="Garamond" w:hAnsi="Garamond"/>
-          <w:b w:val="false"/>
-          <w:bCs w:val="false"/>
-          <w:color w:val="555555"/>
-          <w:sz w:val="21"/>
-          <w:szCs w:val="21"/>
-        </w:rPr>
-        <w:t xml:space="preserve">Who took a post, who did not, and what became of those who decided against the classroom?</w:t>
-      </w:r>
-    </w:p>
-    <w:p>
-      <w:pPr>
-        <w:spacing w:after="40" w:before="0"/>
-        <w:ind w:left="1008" w:hanging="288"/>
-      </w:pPr>
-      <w:r>
-        <w:rPr>
-          <w:rFonts w:ascii="Garamond" w:cs="Garamond" w:eastAsia="Garamond" w:hAnsi="Garamond"/>
-          <w:color w:val="555555"/>
-          <w:sz w:val="21"/>
-          <w:szCs w:val="21"/>
-        </w:rPr>
-        <w:t xml:space="preserve">–	</w:t>
-      </w:r>
-      <w:r>
-        <w:rPr>
-          <w:rFonts w:ascii="Garamond" w:cs="Garamond" w:eastAsia="Garamond" w:hAnsi="Garamond"/>
-          <w:b w:val="false"/>
-          <w:bCs w:val="false"/>
-          <w:color w:val="555555"/>
-          <w:sz w:val="21"/>
-          <w:szCs w:val="21"/>
-        </w:rPr>
-        <w:t xml:space="preserve">Has it been evaluated? What did it cost against what it produced?</w:t>
+        <w:t xml:space="preserve">Is there any record of how well the initiative has worked — placements made, how many led to a post, an evaluation?</w:t>
+      </w:r>
+    </w:p>
+    <w:p>
+      <w:pPr>
+        <w:spacing w:after="40" w:before="0"/>
+        <w:ind w:left="1008" w:hanging="288"/>
+      </w:pPr>
+      <w:r>
+        <w:rPr>
+          <w:rFonts w:ascii="Garamond" w:cs="Garamond" w:eastAsia="Garamond" w:hAnsi="Garamond"/>
+          <w:color w:val="555555"/>
+          <w:sz w:val="21"/>
+          <w:szCs w:val="21"/>
+        </w:rPr>
+        <w:t xml:space="preserve">–	</w:t>
+      </w:r>
+      <w:r>
+        <w:rPr>
+          <w:rFonts w:ascii="Garamond" w:cs="Garamond" w:eastAsia="Garamond" w:hAnsi="Garamond"/>
+          <w:b w:val="false"/>
+          <w:bCs w:val="false"/>
+          <w:color w:val="555555"/>
+          <w:sz w:val="21"/>
+          <w:szCs w:val="21"/>
+        </w:rPr>
+        <w:t xml:space="preserve">What became of those who decided against the classroom?</w:t>
+      </w:r>
+    </w:p>
+    <w:p>
+      <w:pPr>
+        <w:spacing w:after="40" w:before="0"/>
+        <w:ind w:left="1008" w:hanging="288"/>
+      </w:pPr>
+      <w:r>
+        <w:rPr>
+          <w:rFonts w:ascii="Garamond" w:cs="Garamond" w:eastAsia="Garamond" w:hAnsi="Garamond"/>
+          <w:color w:val="555555"/>
+          <w:sz w:val="21"/>
+          <w:szCs w:val="21"/>
+        </w:rPr>
+        <w:t xml:space="preserve">–	</w:t>
+      </w:r>
+      <w:r>
+        <w:rPr>
+          <w:rFonts w:ascii="Garamond" w:cs="Garamond" w:eastAsia="Garamond" w:hAnsi="Garamond"/>
+          <w:b w:val="false"/>
+          <w:bCs w:val="false"/>
+          <w:color w:val="555555"/>
+          <w:sz w:val="21"/>
+          <w:szCs w:val="21"/>
+        </w:rPr>
+        <w:t xml:space="preserve">What did it cost against what it produced?</w:t>
       </w:r>
     </w:p>
     <w:p>
@@ -1504,7 +1404,7 @@
           <w:sz w:val="24"/>
           <w:szCs w:val="24"/>
         </w:rPr>
-        <w:t xml:space="preserve">Where does the initiative stand now, and what would you change?</w:t>
+        <w:t xml:space="preserve">Overall, what is your assessment of its impact, and what would you change if you were designing it again?</w:t>
       </w:r>
     </w:p>
     <w:p>
@@ -1532,7 +1432,7 @@
           <w:sz w:val="24"/>
           <w:szCs w:val="24"/>
         </w:rPr>
-        <w:t xml:space="preserve">Is there someone who has run this closely that we should speak to?</w:t>
+        <w:t xml:space="preserve">Is there someone who has run this closely you would recommend we speak to?</w:t>
       </w:r>
     </w:p>
     <w:p>
@@ -1599,7 +1499,7 @@
           <w:sz w:val="24"/>
           <w:szCs w:val="24"/>
         </w:rPr>
-        <w:t xml:space="preserve"> the direction of the Ministère de l'Éducation responsible for teaching staff and for the operating budget rules of the centres de services scolaires.</w:t>
+        <w:t xml:space="preserve"> the direction of the Ministère de l'Éducation responsible for teaching staff and for the budget rules of the centres de services scolaires.</w:t>
       </w:r>
     </w:p>
     <w:p>
@@ -1654,18 +1554,18 @@
           <w:sz w:val="24"/>
           <w:szCs w:val="24"/>
         </w:rPr>
-        <w:t xml:space="preserve">How did this come about in 2020?</w:t>
-      </w:r>
-      <w:r>
-        <w:rPr>
-          <w:rFonts w:ascii="Garamond" w:cs="Garamond" w:eastAsia="Garamond" w:hAnsi="Garamond"/>
-          <w:b w:val="false"/>
-          <w:bCs w:val="false"/>
-          <w:color w:val="000000"/>
-          <w:sz w:val="24"/>
-          <w:szCs w:val="24"/>
-        </w:rPr>
-        <w:t xml:space="preserve"> Why a pay rule, rather than a programme, a campaign or a change to pension rules?</w:t>
+        <w:t xml:space="preserve">In what context did this measure come about in 2020, and with what purpose?</w:t>
+      </w:r>
+      <w:r>
+        <w:rPr>
+          <w:rFonts w:ascii="Garamond" w:cs="Garamond" w:eastAsia="Garamond" w:hAnsi="Garamond"/>
+          <w:b w:val="false"/>
+          <w:bCs w:val="false"/>
+          <w:color w:val="000000"/>
+          <w:sz w:val="24"/>
+          <w:szCs w:val="24"/>
+        </w:rPr>
+        <w:t xml:space="preserve"> We understand it was a pandemic response; why a pay rule, rather than a programme, a campaign or a change to pension rules?</w:t>
       </w:r>
     </w:p>
     <w:p>
@@ -1696,32 +1596,6 @@
     </w:p>
     <w:p>
       <w:pPr>
-        <w:spacing w:after="40" w:before="0"/>
-        <w:ind w:left="1008" w:hanging="288"/>
-      </w:pPr>
-      <w:r>
-        <w:rPr>
-          <w:rFonts w:ascii="Garamond" w:cs="Garamond" w:eastAsia="Garamond" w:hAnsi="Garamond"/>
-          <w:color w:val="555555"/>
-          <w:sz w:val="21"/>
-          <w:szCs w:val="21"/>
-        </w:rPr>
-        <w:t xml:space="preserve">–	</w:t>
-      </w:r>
-      <w:r>
-        <w:rPr>
-          <w:rFonts w:ascii="Garamond" w:cs="Garamond" w:eastAsia="Garamond" w:hAnsi="Garamond"/>
-          <w:b w:val="false"/>
-          <w:bCs w:val="false"/>
-          <w:color w:val="555555"/>
-          <w:sz w:val="21"/>
-          <w:szCs w:val="21"/>
-        </w:rPr>
-        <w:t xml:space="preserve">Why the budget rules rather than the collective agreement?</w:t>
-      </w:r>
-    </w:p>
-    <w:p>
-      <w:pPr>
         <w:spacing w:after="60" w:before="200"/>
         <w:ind w:left="504" w:hanging="504"/>
       </w:pPr>
@@ -1745,7 +1619,7 @@
           <w:sz w:val="24"/>
           <w:szCs w:val="24"/>
         </w:rPr>
-        <w:t xml:space="preserve">The measure is permanent on the budget side but the agreement carrying it is renewed each year. How does that work?</w:t>
+        <w:t xml:space="preserve">We understand the measure is permanent on the budget side, while the agreement carrying it is renewed each year with the unions. How does that work in practice?</w:t>
       </w:r>
     </w:p>
     <w:p>
@@ -1776,32 +1650,6 @@
     </w:p>
     <w:p>
       <w:pPr>
-        <w:spacing w:after="40" w:before="0"/>
-        <w:ind w:left="1008" w:hanging="288"/>
-      </w:pPr>
-      <w:r>
-        <w:rPr>
-          <w:rFonts w:ascii="Garamond" w:cs="Garamond" w:eastAsia="Garamond" w:hAnsi="Garamond"/>
-          <w:color w:val="555555"/>
-          <w:sz w:val="21"/>
-          <w:szCs w:val="21"/>
-        </w:rPr>
-        <w:t xml:space="preserve">–	</w:t>
-      </w:r>
-      <w:r>
-        <w:rPr>
-          <w:rFonts w:ascii="Garamond" w:cs="Garamond" w:eastAsia="Garamond" w:hAnsi="Garamond"/>
-          <w:b w:val="false"/>
-          <w:bCs w:val="false"/>
-          <w:color w:val="555555"/>
-          <w:sz w:val="21"/>
-          <w:szCs w:val="21"/>
-        </w:rPr>
-        <w:t xml:space="preserve">What will decide the next renewal?</w:t>
-      </w:r>
-    </w:p>
-    <w:p>
-      <w:pPr>
         <w:spacing w:after="60" w:before="200"/>
         <w:ind w:left="504" w:hanging="504"/>
       </w:pPr>
@@ -1877,7 +1725,7 @@
           <w:sz w:val="21"/>
           <w:szCs w:val="21"/>
         </w:rPr>
-        <w:t xml:space="preserve">Some centres are said to call retirees last because they cost more. Do you recognise that? Who bears the premium, the ministry or the school?</w:t>
+        <w:t xml:space="preserve">According to the press, some centres call retirees last because they cost more. Do you recognise that? Who bears the premium, the ministry or the school?</w:t>
       </w:r>
     </w:p>
     <w:p>
@@ -1905,59 +1753,33 @@
           <w:sz w:val="24"/>
           <w:szCs w:val="24"/>
         </w:rPr>
-        <w:t xml:space="preserve">Who comes back, and to do what?</w:t>
-      </w:r>
-    </w:p>
-    <w:p>
-      <w:pPr>
-        <w:spacing w:after="40" w:before="0"/>
-        <w:ind w:left="1008" w:hanging="288"/>
-      </w:pPr>
-      <w:r>
-        <w:rPr>
-          <w:rFonts w:ascii="Garamond" w:cs="Garamond" w:eastAsia="Garamond" w:hAnsi="Garamond"/>
-          <w:color w:val="555555"/>
-          <w:sz w:val="21"/>
-          <w:szCs w:val="21"/>
-        </w:rPr>
-        <w:t xml:space="preserve">–	</w:t>
-      </w:r>
-      <w:r>
-        <w:rPr>
-          <w:rFonts w:ascii="Garamond" w:cs="Garamond" w:eastAsia="Garamond" w:hAnsi="Garamond"/>
-          <w:b w:val="false"/>
-          <w:bCs w:val="false"/>
-          <w:color w:val="555555"/>
-          <w:sz w:val="21"/>
-          <w:szCs w:val="21"/>
-        </w:rPr>
-        <w:t xml:space="preserve">How long after retiring, and for supply days or contracts?</w:t>
-      </w:r>
-    </w:p>
-    <w:p>
-      <w:pPr>
-        <w:spacing w:after="40" w:before="0"/>
-        <w:ind w:left="1008" w:hanging="288"/>
-      </w:pPr>
-      <w:r>
-        <w:rPr>
-          <w:rFonts w:ascii="Garamond" w:cs="Garamond" w:eastAsia="Garamond" w:hAnsi="Garamond"/>
-          <w:color w:val="555555"/>
-          <w:sz w:val="21"/>
-          <w:szCs w:val="21"/>
-        </w:rPr>
-        <w:t xml:space="preserve">–	</w:t>
-      </w:r>
-      <w:r>
-        <w:rPr>
-          <w:rFonts w:ascii="Garamond" w:cs="Garamond" w:eastAsia="Garamond" w:hAnsi="Garamond"/>
-          <w:b w:val="false"/>
-          <w:bCs w:val="false"/>
-          <w:color w:val="555555"/>
-          <w:sz w:val="21"/>
-          <w:szCs w:val="21"/>
-        </w:rPr>
-        <w:t xml:space="preserve">Is the option not to rejoin the pension plan explained to them?</w:t>
+        <w:t xml:space="preserve">How would you describe the retirees who come back — how long after retiring, and to do what?</w:t>
+      </w:r>
+    </w:p>
+    <w:p>
+      <w:pPr>
+        <w:spacing w:after="40" w:before="0"/>
+        <w:ind w:left="1008" w:hanging="288"/>
+      </w:pPr>
+      <w:r>
+        <w:rPr>
+          <w:rFonts w:ascii="Garamond" w:cs="Garamond" w:eastAsia="Garamond" w:hAnsi="Garamond"/>
+          <w:color w:val="555555"/>
+          <w:sz w:val="21"/>
+          <w:szCs w:val="21"/>
+        </w:rPr>
+        <w:t xml:space="preserve">–	</w:t>
+      </w:r>
+      <w:r>
+        <w:rPr>
+          <w:rFonts w:ascii="Garamond" w:cs="Garamond" w:eastAsia="Garamond" w:hAnsi="Garamond"/>
+          <w:b w:val="false"/>
+          <w:bCs w:val="false"/>
+          <w:color w:val="555555"/>
+          <w:sz w:val="21"/>
+          <w:szCs w:val="21"/>
+        </w:rPr>
+        <w:t xml:space="preserve">Supply days or contracts? Is the option not to rejoin the pension plan explained to them?</w:t>
       </w:r>
     </w:p>
     <w:p>
@@ -1985,7 +1807,7 @@
           <w:sz w:val="24"/>
           <w:szCs w:val="24"/>
         </w:rPr>
-        <w:t xml:space="preserve">What came of the minister's letters, and what do they tell you about what moves this group?</w:t>
+        <w:t xml:space="preserve">The minister has written to retired teachers twice. What came of those letters, and what do they tell you about what moves this group?</w:t>
       </w:r>
     </w:p>
     <w:p>
@@ -2039,59 +1861,33 @@
           <w:sz w:val="24"/>
           <w:szCs w:val="24"/>
         </w:rPr>
-        <w:t xml:space="preserve">Do the retirees who return cover the same problem that drives teachers out of the profession, or a different one?</w:t>
-      </w:r>
-    </w:p>
-    <w:p>
-      <w:pPr>
-        <w:spacing w:after="40" w:before="0"/>
-        <w:ind w:left="1008" w:hanging="288"/>
-      </w:pPr>
-      <w:r>
-        <w:rPr>
-          <w:rFonts w:ascii="Garamond" w:cs="Garamond" w:eastAsia="Garamond" w:hAnsi="Garamond"/>
-          <w:color w:val="555555"/>
-          <w:sz w:val="21"/>
-          <w:szCs w:val="21"/>
-        </w:rPr>
-        <w:t xml:space="preserve">–	</w:t>
-      </w:r>
-      <w:r>
-        <w:rPr>
-          <w:rFonts w:ascii="Garamond" w:cs="Garamond" w:eastAsia="Garamond" w:hAnsi="Garamond"/>
-          <w:b w:val="false"/>
-          <w:bCs w:val="false"/>
-          <w:color w:val="555555"/>
-          <w:sz w:val="21"/>
-          <w:szCs w:val="21"/>
-        </w:rPr>
-        <w:t xml:space="preserve">Has the measure changed how absences are covered, and the number of classrooms without a qualified teacher?</w:t>
-      </w:r>
-    </w:p>
-    <w:p>
-      <w:pPr>
-        <w:spacing w:after="40" w:before="0"/>
-        <w:ind w:left="1008" w:hanging="288"/>
-      </w:pPr>
-      <w:r>
-        <w:rPr>
-          <w:rFonts w:ascii="Garamond" w:cs="Garamond" w:eastAsia="Garamond" w:hAnsi="Garamond"/>
-          <w:color w:val="555555"/>
-          <w:sz w:val="21"/>
-          <w:szCs w:val="21"/>
-        </w:rPr>
-        <w:t xml:space="preserve">–	</w:t>
-      </w:r>
-      <w:r>
-        <w:rPr>
-          <w:rFonts w:ascii="Garamond" w:cs="Garamond" w:eastAsia="Garamond" w:hAnsi="Garamond"/>
-          <w:b w:val="false"/>
-          <w:bCs w:val="false"/>
-          <w:color w:val="555555"/>
-          <w:sz w:val="21"/>
-          <w:szCs w:val="21"/>
-        </w:rPr>
-        <w:t xml:space="preserve">Does it reach the mid-career leaver at all?</w:t>
+        <w:t xml:space="preserve">We noticed the ministry's figure of more than 5,000 retirees back in schools in 2024-25. How is that counted, and how has take-up moved since 2020?</w:t>
+      </w:r>
+    </w:p>
+    <w:p>
+      <w:pPr>
+        <w:spacing w:after="40" w:before="0"/>
+        <w:ind w:left="1008" w:hanging="288"/>
+      </w:pPr>
+      <w:r>
+        <w:rPr>
+          <w:rFonts w:ascii="Garamond" w:cs="Garamond" w:eastAsia="Garamond" w:hAnsi="Garamond"/>
+          <w:color w:val="555555"/>
+          <w:sz w:val="21"/>
+          <w:szCs w:val="21"/>
+        </w:rPr>
+        <w:t xml:space="preserve">–	</w:t>
+      </w:r>
+      <w:r>
+        <w:rPr>
+          <w:rFonts w:ascii="Garamond" w:cs="Garamond" w:eastAsia="Garamond" w:hAnsi="Garamond"/>
+          <w:b w:val="false"/>
+          <w:bCs w:val="false"/>
+          <w:color w:val="555555"/>
+          <w:sz w:val="21"/>
+          <w:szCs w:val="21"/>
+        </w:rPr>
+        <w:t xml:space="preserve">Does it count anyone paid for one day, or people with a meaningful volume of work?</w:t>
       </w:r>
     </w:p>
     <w:p>
@@ -2119,59 +1915,33 @@
           <w:sz w:val="24"/>
           <w:szCs w:val="24"/>
         </w:rPr>
-        <w:t xml:space="preserve">How has take-up moved since 2020, and how is it counted?</w:t>
-      </w:r>
-    </w:p>
-    <w:p>
-      <w:pPr>
-        <w:spacing w:after="40" w:before="0"/>
-        <w:ind w:left="1008" w:hanging="288"/>
-      </w:pPr>
-      <w:r>
-        <w:rPr>
-          <w:rFonts w:ascii="Garamond" w:cs="Garamond" w:eastAsia="Garamond" w:hAnsi="Garamond"/>
-          <w:color w:val="555555"/>
-          <w:sz w:val="21"/>
-          <w:szCs w:val="21"/>
-        </w:rPr>
-        <w:t xml:space="preserve">–	</w:t>
-      </w:r>
-      <w:r>
-        <w:rPr>
-          <w:rFonts w:ascii="Garamond" w:cs="Garamond" w:eastAsia="Garamond" w:hAnsi="Garamond"/>
-          <w:b w:val="false"/>
-          <w:bCs w:val="false"/>
-          <w:color w:val="555555"/>
-          <w:sz w:val="21"/>
-          <w:szCs w:val="21"/>
-        </w:rPr>
-        <w:t xml:space="preserve">Does the 5,000 count anyone paid for one day, or people with a meaningful volume of work?</w:t>
-      </w:r>
-    </w:p>
-    <w:p>
-      <w:pPr>
-        <w:spacing w:after="40" w:before="0"/>
-        <w:ind w:left="1008" w:hanging="288"/>
-      </w:pPr>
-      <w:r>
-        <w:rPr>
-          <w:rFonts w:ascii="Garamond" w:cs="Garamond" w:eastAsia="Garamond" w:hAnsi="Garamond"/>
-          <w:color w:val="555555"/>
-          <w:sz w:val="21"/>
-          <w:szCs w:val="21"/>
-        </w:rPr>
-        <w:t xml:space="preserve">–	</w:t>
-      </w:r>
-      <w:r>
-        <w:rPr>
-          <w:rFonts w:ascii="Garamond" w:cs="Garamond" w:eastAsia="Garamond" w:hAnsi="Garamond"/>
-          <w:b w:val="false"/>
-          <w:bCs w:val="false"/>
-          <w:color w:val="555555"/>
-          <w:sz w:val="21"/>
-          <w:szCs w:val="21"/>
-        </w:rPr>
-        <w:t xml:space="preserve">Has the ministry assessed the measure? What has it solved, and what not?</w:t>
+        <w:t xml:space="preserve">Is there any record of what the measure has changed — how absences are covered, the number of classrooms without a qualified teacher, an assessment?</w:t>
+      </w:r>
+    </w:p>
+    <w:p>
+      <w:pPr>
+        <w:spacing w:after="40" w:before="0"/>
+        <w:ind w:left="1008" w:hanging="288"/>
+      </w:pPr>
+      <w:r>
+        <w:rPr>
+          <w:rFonts w:ascii="Garamond" w:cs="Garamond" w:eastAsia="Garamond" w:hAnsi="Garamond"/>
+          <w:color w:val="555555"/>
+          <w:sz w:val="21"/>
+          <w:szCs w:val="21"/>
+        </w:rPr>
+        <w:t xml:space="preserve">–	</w:t>
+      </w:r>
+      <w:r>
+        <w:rPr>
+          <w:rFonts w:ascii="Garamond" w:cs="Garamond" w:eastAsia="Garamond" w:hAnsi="Garamond"/>
+          <w:b w:val="false"/>
+          <w:bCs w:val="false"/>
+          <w:color w:val="555555"/>
+          <w:sz w:val="21"/>
+          <w:szCs w:val="21"/>
+        </w:rPr>
+        <w:t xml:space="preserve">Does it reach the mid-career leaver at all, or only the retiree?</w:t>
       </w:r>
     </w:p>
     <w:p>
@@ -2199,7 +1969,35 @@
           <w:sz w:val="24"/>
           <w:szCs w:val="24"/>
         </w:rPr>
-        <w:t xml:space="preserve">Is there someone who has followed this closely that we should speak to?</w:t>
+        <w:t xml:space="preserve">Overall, what is your assessment of its impact, and what will decide the next renewal?</w:t>
+      </w:r>
+    </w:p>
+    <w:p>
+      <w:pPr>
+        <w:spacing w:after="60" w:before="200"/>
+        <w:ind w:left="504" w:hanging="504"/>
+      </w:pPr>
+      <w:r>
+        <w:rPr>
+          <w:rFonts w:ascii="Garamond" w:cs="Garamond" w:eastAsia="Garamond" w:hAnsi="Garamond"/>
+          <w:b/>
+          <w:bCs/>
+          <w:color w:val="000000"/>
+          <w:sz w:val="24"/>
+          <w:szCs w:val="24"/>
+        </w:rPr>
+        <w:t xml:space="preserve">9.	</w:t>
+      </w:r>
+      <w:r>
+        <w:rPr>
+          <w:rFonts w:ascii="Garamond" w:cs="Garamond" w:eastAsia="Garamond" w:hAnsi="Garamond"/>
+          <w:b/>
+          <w:bCs/>
+          <w:color w:val="000000"/>
+          <w:sz w:val="24"/>
+          <w:szCs w:val="24"/>
+        </w:rPr>
+        <w:t xml:space="preserve">Is there someone who has followed this closely you would recommend we speak to?</w:t>
       </w:r>
     </w:p>
     <w:p>
@@ -2293,7 +2091,7 @@
           <w:sz w:val="24"/>
           <w:szCs w:val="24"/>
         </w:rPr>
-        <w:t xml:space="preserve"> the Teacher Work Department of the Ministry of Education, which issues the plan with the Ministry of Finance, and if possible a provincial education department that recruits for it.</w:t>
+        <w:t xml:space="preserve"> the Teacher Work Department of the Ministry of Education, and if possible a provincial education department that recruits for the plan.</w:t>
       </w:r>
     </w:p>
     <w:p>
@@ -2348,7 +2146,18 @@
           <w:sz w:val="24"/>
           <w:szCs w:val="24"/>
         </w:rPr>
-        <w:t xml:space="preserve">How did the plan start in 2018, and what was it meant to do that other measures for rural schools were not doing?</w:t>
+        <w:t xml:space="preserve">In what context did the plan come about in 2018, and with what purpose?</w:t>
+      </w:r>
+      <w:r>
+        <w:rPr>
+          <w:rFonts w:ascii="Garamond" w:cs="Garamond" w:eastAsia="Garamond" w:hAnsi="Garamond"/>
+          <w:b w:val="false"/>
+          <w:bCs w:val="false"/>
+          <w:color w:val="000000"/>
+          <w:sz w:val="24"/>
+          <w:szCs w:val="24"/>
+        </w:rPr>
+        <w:t xml:space="preserve"> What was it meant to do that other measures for rural schools were not doing?</w:t>
       </w:r>
     </w:p>
     <w:p>
@@ -2428,7 +2237,7 @@
           <w:sz w:val="24"/>
           <w:szCs w:val="24"/>
         </w:rPr>
-        <w:t xml:space="preserve">From application to a classroom in a distant county, how does it work?</w:t>
+        <w:t xml:space="preserve">How would you describe the path from application to a classroom in a distant county?</w:t>
       </w:r>
     </w:p>
     <w:p>
@@ -2508,33 +2317,7 @@
           <w:sz w:val="24"/>
           <w:szCs w:val="24"/>
         </w:rPr>
-        <w:t xml:space="preserve">What does a silver-age teacher do in the school week?</w:t>
-      </w:r>
-    </w:p>
-    <w:p>
-      <w:pPr>
-        <w:spacing w:after="40" w:before="0"/>
-        <w:ind w:left="1008" w:hanging="288"/>
-      </w:pPr>
-      <w:r>
-        <w:rPr>
-          <w:rFonts w:ascii="Garamond" w:cs="Garamond" w:eastAsia="Garamond" w:hAnsi="Garamond"/>
-          <w:color w:val="555555"/>
-          <w:sz w:val="21"/>
-          <w:szCs w:val="21"/>
-        </w:rPr>
-        <w:t xml:space="preserve">–	</w:t>
-      </w:r>
-      <w:r>
-        <w:rPr>
-          <w:rFonts w:ascii="Garamond" w:cs="Garamond" w:eastAsia="Garamond" w:hAnsi="Garamond"/>
-          <w:b w:val="false"/>
-          <w:bCs w:val="false"/>
-          <w:color w:val="555555"/>
-          <w:sz w:val="21"/>
-          <w:szCs w:val="21"/>
-        </w:rPr>
-        <w:t xml:space="preserve">How is the balance struck between teaching, mentoring young teachers and advising the leadership?</w:t>
+        <w:t xml:space="preserve">We understand a silver-age teacher both teaches and works with the young teachers of the school. How is that balance struck in practice?</w:t>
       </w:r>
     </w:p>
     <w:p>
@@ -2748,33 +2531,33 @@
           <w:sz w:val="24"/>
           <w:szCs w:val="24"/>
         </w:rPr>
-        <w:t xml:space="preserve">Is a silver-age teacher an answer to why teachers leave rural schools, or never go to them, or an answer to something else?</w:t>
-      </w:r>
-    </w:p>
-    <w:p>
-      <w:pPr>
-        <w:spacing w:after="40" w:before="0"/>
-        <w:ind w:left="1008" w:hanging="288"/>
-      </w:pPr>
-      <w:r>
-        <w:rPr>
-          <w:rFonts w:ascii="Garamond" w:cs="Garamond" w:eastAsia="Garamond" w:hAnsi="Garamond"/>
-          <w:color w:val="555555"/>
-          <w:sz w:val="21"/>
-          <w:szCs w:val="21"/>
-        </w:rPr>
-        <w:t xml:space="preserve">–	</w:t>
-      </w:r>
-      <w:r>
-        <w:rPr>
-          <w:rFonts w:ascii="Garamond" w:cs="Garamond" w:eastAsia="Garamond" w:hAnsi="Garamond"/>
-          <w:b w:val="false"/>
-          <w:bCs w:val="false"/>
-          <w:color w:val="555555"/>
-          <w:sz w:val="21"/>
-          <w:szCs w:val="21"/>
-        </w:rPr>
-        <w:t xml:space="preserve">Does their presence change whether young teachers stay?</w:t>
+        <w:t xml:space="preserve">We noticed that the annual notices ask provinces to raise their completion rate. How has recruitment gone against the plan, and where is the difficulty?</w:t>
+      </w:r>
+    </w:p>
+    <w:p>
+      <w:pPr>
+        <w:spacing w:after="40" w:before="0"/>
+        <w:ind w:left="1008" w:hanging="288"/>
+      </w:pPr>
+      <w:r>
+        <w:rPr>
+          <w:rFonts w:ascii="Garamond" w:cs="Garamond" w:eastAsia="Garamond" w:hAnsi="Garamond"/>
+          <w:color w:val="555555"/>
+          <w:sz w:val="21"/>
+          <w:szCs w:val="21"/>
+        </w:rPr>
+        <w:t xml:space="preserve">–	</w:t>
+      </w:r>
+      <w:r>
+        <w:rPr>
+          <w:rFonts w:ascii="Garamond" w:cs="Garamond" w:eastAsia="Garamond" w:hAnsi="Garamond"/>
+          <w:b w:val="false"/>
+          <w:bCs w:val="false"/>
+          <w:color w:val="555555"/>
+          <w:sz w:val="21"/>
+          <w:szCs w:val="21"/>
+        </w:rPr>
+        <w:t xml:space="preserve">How is progress towards 120,000 measured, and where does it stand?</w:t>
       </w:r>
     </w:p>
     <w:p>
@@ -2802,59 +2585,7 @@
           <w:sz w:val="24"/>
           <w:szCs w:val="24"/>
         </w:rPr>
-        <w:t xml:space="preserve">How has recruitment gone against the annual plan, and where is the difficulty?</w:t>
-      </w:r>
-    </w:p>
-    <w:p>
-      <w:pPr>
-        <w:spacing w:after="40" w:before="0"/>
-        <w:ind w:left="1008" w:hanging="288"/>
-      </w:pPr>
-      <w:r>
-        <w:rPr>
-          <w:rFonts w:ascii="Garamond" w:cs="Garamond" w:eastAsia="Garamond" w:hAnsi="Garamond"/>
-          <w:color w:val="555555"/>
-          <w:sz w:val="21"/>
-          <w:szCs w:val="21"/>
-        </w:rPr>
-        <w:t xml:space="preserve">–	</w:t>
-      </w:r>
-      <w:r>
-        <w:rPr>
-          <w:rFonts w:ascii="Garamond" w:cs="Garamond" w:eastAsia="Garamond" w:hAnsi="Garamond"/>
-          <w:b w:val="false"/>
-          <w:bCs w:val="false"/>
-          <w:color w:val="555555"/>
-          <w:sz w:val="21"/>
-          <w:szCs w:val="21"/>
-        </w:rPr>
-        <w:t xml:space="preserve">How is progress towards 120,000 measured, and where does it stand?</w:t>
-      </w:r>
-    </w:p>
-    <w:p>
-      <w:pPr>
-        <w:spacing w:after="40" w:before="0"/>
-        <w:ind w:left="1008" w:hanging="288"/>
-      </w:pPr>
-      <w:r>
-        <w:rPr>
-          <w:rFonts w:ascii="Garamond" w:cs="Garamond" w:eastAsia="Garamond" w:hAnsi="Garamond"/>
-          <w:color w:val="555555"/>
-          <w:sz w:val="21"/>
-          <w:szCs w:val="21"/>
-        </w:rPr>
-        <w:t xml:space="preserve">–	</w:t>
-      </w:r>
-      <w:r>
-        <w:rPr>
-          <w:rFonts w:ascii="Garamond" w:cs="Garamond" w:eastAsia="Garamond" w:hAnsi="Garamond"/>
-          <w:b w:val="false"/>
-          <w:bCs w:val="false"/>
-          <w:color w:val="555555"/>
-          <w:sz w:val="21"/>
-          <w:szCs w:val="21"/>
-        </w:rPr>
-        <w:t xml:space="preserve">Has anyone looked at what the plan changed in the receiving schools?</w:t>
+        <w:t xml:space="preserve">Is there any record of what the plan has changed in the receiving schools — for the pupils, for the young teachers, for whether they stay?</w:t>
       </w:r>
     </w:p>
     <w:p>
@@ -2882,7 +2613,7 @@
           <w:sz w:val="24"/>
           <w:szCs w:val="24"/>
         </w:rPr>
-        <w:t xml:space="preserve">What should a country with an ageing teaching profession take from this, and what should it avoid?</w:t>
+        <w:t xml:space="preserve">Overall, what is your assessment of the plan, and what should a country with an ageing teaching profession take from it, or avoid?</w:t>
       </w:r>
     </w:p>
     <w:p>
@@ -2910,7 +2641,7 @@
           <w:sz w:val="24"/>
           <w:szCs w:val="24"/>
         </w:rPr>
-        <w:t xml:space="preserve">Is there someone at the ministry, or in a province that recruits for the plan, we should speak to?</w:t>
+        <w:t xml:space="preserve">Is there someone at the ministry, or in a province that recruits for the plan, you would recommend we speak to?</w:t>
       </w:r>
     </w:p>
     <w:p>
@@ -3060,7 +2791,18 @@
           <w:sz w:val="24"/>
           <w:szCs w:val="24"/>
         </w:rPr>
-        <w:t xml:space="preserve">How did the scheme come about, and why pay the school rather than the teacher?</w:t>
+        <w:t xml:space="preserve">In what context did the scheme come about in 2017, and with what purpose?</w:t>
+      </w:r>
+      <w:r>
+        <w:rPr>
+          <w:rFonts w:ascii="Garamond" w:cs="Garamond" w:eastAsia="Garamond" w:hAnsi="Garamond"/>
+          <w:b w:val="false"/>
+          <w:bCs w:val="false"/>
+          <w:color w:val="000000"/>
+          <w:sz w:val="24"/>
+          <w:szCs w:val="24"/>
+        </w:rPr>
+        <w:t xml:space="preserve"> Why pay the school rather than the teacher?</w:t>
       </w:r>
     </w:p>
     <w:p>
@@ -3091,32 +2833,6 @@
     </w:p>
     <w:p>
       <w:pPr>
-        <w:spacing w:after="40" w:before="0"/>
-        <w:ind w:left="1008" w:hanging="288"/>
-      </w:pPr>
-      <w:r>
-        <w:rPr>
-          <w:rFonts w:ascii="Garamond" w:cs="Garamond" w:eastAsia="Garamond" w:hAnsi="Garamond"/>
-          <w:color w:val="555555"/>
-          <w:sz w:val="21"/>
-          <w:szCs w:val="21"/>
-        </w:rPr>
-        <w:t xml:space="preserve">–	</w:t>
-      </w:r>
-      <w:r>
-        <w:rPr>
-          <w:rFonts w:ascii="Garamond" w:cs="Garamond" w:eastAsia="Garamond" w:hAnsi="Garamond"/>
-          <w:b w:val="false"/>
-          <w:bCs w:val="false"/>
-          <w:color w:val="555555"/>
-          <w:sz w:val="21"/>
-          <w:szCs w:val="21"/>
-        </w:rPr>
-        <w:t xml:space="preserve">Who pushed for it?</w:t>
-      </w:r>
-    </w:p>
-    <w:p>
-      <w:pPr>
         <w:spacing w:after="60" w:before="200"/>
         <w:ind w:left="504" w:hanging="504"/>
       </w:pPr>
@@ -3194,7 +2910,7 @@
           <w:sz w:val="24"/>
           <w:szCs w:val="24"/>
         </w:rPr>
-        <w:t xml:space="preserve">Our reading is that much less of the money was used than was available. Is that right, and why?</w:t>
+        <w:t xml:space="preserve">According to the figures we have seen, much less of the money was used than was available. Is that right, and why?</w:t>
       </w:r>
     </w:p>
     <w:p>
@@ -3274,7 +2990,7 @@
           <w:sz w:val="24"/>
           <w:szCs w:val="24"/>
         </w:rPr>
-        <w:t xml:space="preserve">The scheme was extended in 2019 and then allowed to lapse in 2022 with nothing of the same kind in its place. How were those decisions taken?</w:t>
+        <w:t xml:space="preserve">We understand the scheme was extended in 2019 and then allowed to lapse in 2022 with nothing of the same kind in its place. How were those decisions taken?</w:t>
       </w:r>
     </w:p>
     <w:p>
@@ -3354,44 +3070,44 @@
           <w:sz w:val="24"/>
           <w:szCs w:val="24"/>
         </w:rPr>
-        <w:t xml:space="preserve">Who are the herintreders?</w:t>
-      </w:r>
-      <w:r>
-        <w:rPr>
-          <w:rFonts w:ascii="Garamond" w:cs="Garamond" w:eastAsia="Garamond" w:hAnsi="Garamond"/>
-          <w:b w:val="false"/>
-          <w:bCs w:val="false"/>
-          <w:color w:val="000000"/>
-          <w:sz w:val="24"/>
-          <w:szCs w:val="24"/>
-        </w:rPr>
-        <w:t xml:space="preserve"> The definition also covers people who qualified and never started.</w:t>
-      </w:r>
-    </w:p>
-    <w:p>
-      <w:pPr>
-        <w:spacing w:after="40" w:before="0"/>
-        <w:ind w:left="1008" w:hanging="288"/>
-      </w:pPr>
-      <w:r>
-        <w:rPr>
-          <w:rFonts w:ascii="Garamond" w:cs="Garamond" w:eastAsia="Garamond" w:hAnsi="Garamond"/>
-          <w:color w:val="555555"/>
-          <w:sz w:val="21"/>
-          <w:szCs w:val="21"/>
-        </w:rPr>
-        <w:t xml:space="preserve">–	</w:t>
-      </w:r>
-      <w:r>
-        <w:rPr>
-          <w:rFonts w:ascii="Garamond" w:cs="Garamond" w:eastAsia="Garamond" w:hAnsi="Garamond"/>
-          <w:b w:val="false"/>
-          <w:bCs w:val="false"/>
-          <w:color w:val="555555"/>
-          <w:sz w:val="21"/>
-          <w:szCs w:val="21"/>
-        </w:rPr>
-        <w:t xml:space="preserve">Why did they leave primary teaching, and what made returning possible?</w:t>
+        <w:t xml:space="preserve">How would you describe the herintreders who came back?</w:t>
+      </w:r>
+      <w:r>
+        <w:rPr>
+          <w:rFonts w:ascii="Garamond" w:cs="Garamond" w:eastAsia="Garamond" w:hAnsi="Garamond"/>
+          <w:b w:val="false"/>
+          <w:bCs w:val="false"/>
+          <w:color w:val="000000"/>
+          <w:sz w:val="24"/>
+          <w:szCs w:val="24"/>
+        </w:rPr>
+        <w:t xml:space="preserve"> We are aware the definition also covers people who qualified and never started.</w:t>
+      </w:r>
+    </w:p>
+    <w:p>
+      <w:pPr>
+        <w:spacing w:after="40" w:before="0"/>
+        <w:ind w:left="1008" w:hanging="288"/>
+      </w:pPr>
+      <w:r>
+        <w:rPr>
+          <w:rFonts w:ascii="Garamond" w:cs="Garamond" w:eastAsia="Garamond" w:hAnsi="Garamond"/>
+          <w:color w:val="555555"/>
+          <w:sz w:val="21"/>
+          <w:szCs w:val="21"/>
+        </w:rPr>
+        <w:t xml:space="preserve">–	</w:t>
+      </w:r>
+      <w:r>
+        <w:rPr>
+          <w:rFonts w:ascii="Garamond" w:cs="Garamond" w:eastAsia="Garamond" w:hAnsi="Garamond"/>
+          <w:b w:val="false"/>
+          <w:bCs w:val="false"/>
+          <w:color w:val="555555"/>
+          <w:sz w:val="21"/>
+          <w:szCs w:val="21"/>
+        </w:rPr>
+        <w:t xml:space="preserve">Why had they left primary teaching, and what made returning possible?</w:t>
       </w:r>
     </w:p>
     <w:p>
@@ -3445,37 +3161,37 @@
           <w:sz w:val="24"/>
           <w:szCs w:val="24"/>
         </w:rPr>
+        <w:t xml:space="preserve">We noticed that the number of returners in primary education has halved in a decade while the shortage persisted. How do you read that?</w:t>
+      </w:r>
+    </w:p>
+    <w:p>
+      <w:pPr>
+        <w:spacing w:after="40" w:before="0"/>
+        <w:ind w:left="1008" w:hanging="288"/>
+      </w:pPr>
+      <w:r>
+        <w:rPr>
+          <w:rFonts w:ascii="Garamond" w:cs="Garamond" w:eastAsia="Garamond" w:hAnsi="Garamond"/>
+          <w:color w:val="555555"/>
+          <w:sz w:val="21"/>
+          <w:szCs w:val="21"/>
+        </w:rPr>
+        <w:t xml:space="preserve">–	</w:t>
+      </w:r>
+      <w:r>
+        <w:rPr>
+          <w:rFonts w:ascii="Garamond" w:cs="Garamond" w:eastAsia="Garamond" w:hAnsi="Garamond"/>
+          <w:b w:val="false"/>
+          <w:bCs w:val="false"/>
+          <w:color w:val="555555"/>
+          <w:sz w:val="21"/>
+          <w:szCs w:val="21"/>
+        </w:rPr>
         <w:t xml:space="preserve">Primary teachers leave over workload, class size and leadership. Does a grant to the school reach any of that?</w:t>
       </w:r>
     </w:p>
     <w:p>
       <w:pPr>
-        <w:spacing w:after="40" w:before="0"/>
-        <w:ind w:left="1008" w:hanging="288"/>
-      </w:pPr>
-      <w:r>
-        <w:rPr>
-          <w:rFonts w:ascii="Garamond" w:cs="Garamond" w:eastAsia="Garamond" w:hAnsi="Garamond"/>
-          <w:color w:val="555555"/>
-          <w:sz w:val="21"/>
-          <w:szCs w:val="21"/>
-        </w:rPr>
-        <w:t xml:space="preserve">–	</w:t>
-      </w:r>
-      <w:r>
-        <w:rPr>
-          <w:rFonts w:ascii="Garamond" w:cs="Garamond" w:eastAsia="Garamond" w:hAnsi="Garamond"/>
-          <w:b w:val="false"/>
-          <w:bCs w:val="false"/>
-          <w:color w:val="555555"/>
-          <w:sz w:val="21"/>
-          <w:szCs w:val="21"/>
-        </w:rPr>
-        <w:t xml:space="preserve">The number of returners in primary education has halved in a decade while the shortage persisted. How do you read that?</w:t>
-      </w:r>
-    </w:p>
-    <w:p>
-      <w:pPr>
         <w:spacing w:after="60" w:before="200"/>
         <w:ind w:left="504" w:hanging="504"/>
       </w:pPr>
@@ -3499,33 +3215,7 @@
           <w:sz w:val="24"/>
           <w:szCs w:val="24"/>
         </w:rPr>
-        <w:t xml:space="preserve">The debate about the silent reserve now turns on whether the pool is really available, given how many already work elsewhere. Where has the ministry landed, and what follows for policy?</w:t>
-      </w:r>
-    </w:p>
-    <w:p>
-      <w:pPr>
-        <w:spacing w:after="40" w:before="0"/>
-        <w:ind w:left="1008" w:hanging="288"/>
-      </w:pPr>
-      <w:r>
-        <w:rPr>
-          <w:rFonts w:ascii="Garamond" w:cs="Garamond" w:eastAsia="Garamond" w:hAnsi="Garamond"/>
-          <w:color w:val="555555"/>
-          <w:sz w:val="21"/>
-          <w:szCs w:val="21"/>
-        </w:rPr>
-        <w:t xml:space="preserve">–	</w:t>
-      </w:r>
-      <w:r>
-        <w:rPr>
-          <w:rFonts w:ascii="Garamond" w:cs="Garamond" w:eastAsia="Garamond" w:hAnsi="Garamond"/>
-          <w:b w:val="false"/>
-          <w:bCs w:val="false"/>
-          <w:color w:val="555555"/>
-          <w:sz w:val="21"/>
-          <w:szCs w:val="21"/>
-        </w:rPr>
-        <w:t xml:space="preserve">Did the teachers who came back through the scheme stay?</w:t>
+        <w:t xml:space="preserve">Is there any record of whether the teachers who came back through the scheme stayed?</w:t>
       </w:r>
     </w:p>
     <w:p>
@@ -3553,7 +3243,35 @@
           <w:sz w:val="24"/>
           <w:szCs w:val="24"/>
         </w:rPr>
-        <w:t xml:space="preserve">Is there someone at the ministry or at the agency we should speak to?</w:t>
+        <w:t xml:space="preserve">Overall, what is your assessment of the scheme, and where has the ministry landed on whether the silent reserve is really available?</w:t>
+      </w:r>
+    </w:p>
+    <w:p>
+      <w:pPr>
+        <w:spacing w:after="60" w:before="200"/>
+        <w:ind w:left="504" w:hanging="504"/>
+      </w:pPr>
+      <w:r>
+        <w:rPr>
+          <w:rFonts w:ascii="Garamond" w:cs="Garamond" w:eastAsia="Garamond" w:hAnsi="Garamond"/>
+          <w:b/>
+          <w:bCs/>
+          <w:color w:val="000000"/>
+          <w:sz w:val="24"/>
+          <w:szCs w:val="24"/>
+        </w:rPr>
+        <w:t xml:space="preserve">9.	</w:t>
+      </w:r>
+      <w:r>
+        <w:rPr>
+          <w:rFonts w:ascii="Garamond" w:cs="Garamond" w:eastAsia="Garamond" w:hAnsi="Garamond"/>
+          <w:b/>
+          <w:bCs/>
+          <w:color w:val="000000"/>
+          <w:sz w:val="24"/>
+          <w:szCs w:val="24"/>
+        </w:rPr>
+        <w:t xml:space="preserve">Is there someone at the ministry or at the agency you would recommend we speak to?</w:t>
       </w:r>
     </w:p>
     <w:p>
@@ -3620,7 +3338,7 @@
           <w:sz w:val="24"/>
           <w:szCs w:val="24"/>
         </w:rPr>
-        <w:t xml:space="preserve"> in each state, the teachers' retirement system, which administers the return and holds the records, and the department of education or certification board, which controls the licence.</w:t>
+        <w:t xml:space="preserve"> in each state, the teachers' retirement system and the department of education or certification board.</w:t>
       </w:r>
     </w:p>
     <w:p>
@@ -3692,7 +3410,18 @@
           <w:sz w:val="24"/>
           <w:szCs w:val="24"/>
         </w:rPr>
-        <w:t xml:space="preserve">How did this come about, and what problem was it meant to solve?</w:t>
+        <w:t xml:space="preserve">In what context did this law come about, and with what purpose?</w:t>
+      </w:r>
+      <w:r>
+        <w:rPr>
+          <w:rFonts w:ascii="Garamond" w:cs="Garamond" w:eastAsia="Garamond" w:hAnsi="Garamond"/>
+          <w:b w:val="false"/>
+          <w:bCs w:val="false"/>
+          <w:color w:val="000000"/>
+          <w:sz w:val="24"/>
+          <w:szCs w:val="24"/>
+        </w:rPr>
+        <w:t xml:space="preserve"> Was the shortage severe at the time?</w:t>
       </w:r>
     </w:p>
     <w:p>
@@ -3772,7 +3501,7 @@
           <w:sz w:val="24"/>
           <w:szCs w:val="24"/>
         </w:rPr>
-        <w:t xml:space="preserve">Of the four levers — waiting period, earnings ceiling, shortage designation, duration — which were argued over, and why did they land where they did?</w:t>
+        <w:t xml:space="preserve">We understand the rules are built from a few levers — waiting period, earnings ceiling, shortage designation, duration. Which were argued over, and why did they land where they did?</w:t>
       </w:r>
     </w:p>
     <w:p>
@@ -3826,7 +3555,7 @@
           <w:sz w:val="24"/>
           <w:szCs w:val="24"/>
         </w:rPr>
-        <w:t xml:space="preserve">What does a retiree have to do to come back, and who decides?</w:t>
+        <w:t xml:space="preserve">How would you describe what a retiree has to do to come back, and who decides?</w:t>
       </w:r>
     </w:p>
     <w:p>
@@ -4012,33 +3741,7 @@
           <w:sz w:val="24"/>
           <w:szCs w:val="24"/>
         </w:rPr>
-        <w:t xml:space="preserve">Is a returning retiree an answer to why teachers leave your schools, or an answer to something else?</w:t>
-      </w:r>
-    </w:p>
-    <w:p>
-      <w:pPr>
-        <w:spacing w:after="40" w:before="0"/>
-        <w:ind w:left="1008" w:hanging="288"/>
-      </w:pPr>
-      <w:r>
-        <w:rPr>
-          <w:rFonts w:ascii="Garamond" w:cs="Garamond" w:eastAsia="Garamond" w:hAnsi="Garamond"/>
-          <w:color w:val="555555"/>
-          <w:sz w:val="21"/>
-          <w:szCs w:val="21"/>
-        </w:rPr>
-        <w:t xml:space="preserve">–	</w:t>
-      </w:r>
-      <w:r>
-        <w:rPr>
-          <w:rFonts w:ascii="Garamond" w:cs="Garamond" w:eastAsia="Garamond" w:hAnsi="Garamond"/>
-          <w:b w:val="false"/>
-          <w:bCs w:val="false"/>
-          <w:color w:val="555555"/>
-          <w:sz w:val="21"/>
-          <w:szCs w:val="21"/>
-        </w:rPr>
-        <w:t xml:space="preserve">Do returning retirees take posts that would otherwise go to new teachers, and has anyone looked?</w:t>
+        <w:t xml:space="preserve">According to the research we have seen, there is a concern that returning retirees take posts that would otherwise go to new teachers. Has anyone looked at that in your state?</w:t>
       </w:r>
     </w:p>
     <w:p>
@@ -4066,7 +3769,7 @@
           <w:sz w:val="24"/>
           <w:szCs w:val="24"/>
         </w:rPr>
-        <w:t xml:space="preserve">How many have returned, and how are they counted?</w:t>
+        <w:t xml:space="preserve">Is there any record of how many have returned, and how are they counted?</w:t>
       </w:r>
     </w:p>
     <w:p>
@@ -4146,7 +3849,7 @@
           <w:sz w:val="24"/>
           <w:szCs w:val="24"/>
         </w:rPr>
-        <w:t xml:space="preserve">Several of these laws expire. What will decide whether yours is kept, and what would you want to know first?</w:t>
+        <w:t xml:space="preserve">Overall, what is your assessment of its impact, and what will decide whether it is kept when it expires?</w:t>
       </w:r>
     </w:p>
     <w:p>
@@ -4200,7 +3903,7 @@
           <w:sz w:val="24"/>
           <w:szCs w:val="24"/>
         </w:rPr>
-        <w:t xml:space="preserve">Is there someone at the retirement system or on the certification side we should speak to?</w:t>
+        <w:t xml:space="preserve">Is there someone at the retirement system or on the certification side you would recommend we speak to?</w:t>
       </w:r>
     </w:p>
     <w:p>

</xml_diff>

<commit_message>
Interview scripts: "what we know" blocks in the deck's order
Each block now says first what the policy is and since when, then the figures,
and closes with what the record does not tell us.

Co-Authored-By: Claude Fable 5.1 <noreply@anthropic.com>
Claude-Session: https://claude.ai/code/session_01REVwghctKjYh8VQ919ThdA
</commit_message>
<xml_diff>
--- a/policies/interviews/Interview_scripts.docx
+++ b/policies/interviews/Interview_scripts.docx
@@ -255,7 +255,7 @@
           <w:sz w:val="24"/>
           <w:szCs w:val="24"/>
         </w:rPr>
-        <w:t xml:space="preserve"> From November 2023 the Department went through its own records of teachers who had left in the previous five years and approached more than 1,500 of them. By May 2024, 260 had expressed interest and 145 had joined the pool of casual and temporary teachers serving more than 600 schools, about six in ten of them retirees. Returners are helped with accreditation, approval to teach and the working-with-children check, and register on the casual booking platform schools use. A shorter re-accreditation route for retired teachers appeared at the standards authority the month the calls began. The press described the outreach as cold-calling; the Department has not said what the channel was. No figures have been published since May 2024.</w:t>
+        <w:t xml:space="preserve"> Teachers Re-Engage is an initiative of the NSW Department of Education, running since November 2023, under which the Department goes through its own records of teachers who left in the previous five years and invites them back. Those interested are helped with accreditation, approval to teach and the working-with-children check, and register on the casual booking platform schools use; a shorter re-accreditation route for retired teachers appeared at the standards authority the same month. By May 2024 more than 1,500 former teachers had been contacted, 260 had expressed interest and 145 had joined the pool of casual and temporary teachers serving more than 600 schools, about six in ten of them retirees. What we do not know: how the teachers were contacted (the press says by phone; the Department has not said), what became of the 145, and whether the initiative is still running, since nothing has been published since May 2024.</w:t>
       </w:r>
     </w:p>
     <w:p>
@@ -883,7 +883,7 @@
           <w:sz w:val="24"/>
           <w:szCs w:val="24"/>
         </w:rPr>
-        <w:t xml:space="preserve"> The initiative opened in late 2022 as a call for expressions of interest, answered by more than 1,100 teachers; the 2023/24 State Budget then put 12 million dollars into paid placements of up to forty days in government schools, to be completed by June 2025. A teacher away from a fixed-term or ongoing post for a year or more registers, the team calls, coaching is offered on applications and the current curriculum, and a placement is arranged with a serving teacher alongside. Returners from a career break or retirement receive an honorarium of up to 12,000 dollars; teachers returning from more than two years of parental absence resume duty temporarily on their own salary. The current departmental pages describe the placement as school-funded at 330 dollars a day, which we have not been able to confirm. No figure on placements made, or on how many led to a post, has been published.</w:t>
+        <w:t xml:space="preserve"> The Teacher Re-Engagement Initiative is a scheme of the Victorian Department of Education, running since late 2022, that offers teachers who have been away from a fixed-term or ongoing post for a year or more a paid placement of up to forty days in a government school before they apply for a job. The teacher registers, the re-engagement team calls, coaching is offered on applications and the current curriculum, and a placement is arranged with a serving teacher alongside; returners from a career break or retirement receive an honorarium of up to 12,000 dollars, while teachers back from more than two years of parental absence resume duty temporarily on their own salary. More than 1,100 teachers registered interest in the first months, and the 2023/24 State Budget put 12 million dollars into placements to be completed by June 2025. What we do not know: how many placements were made and how many led to a post, since no figure has been published, and whether the placement is now funded by the school at 330 dollars a day, as the current departmental pages suggest.</w:t>
       </w:r>
     </w:p>
     <w:p>
@@ -1526,7 +1526,7 @@
           <w:sz w:val="24"/>
           <w:szCs w:val="24"/>
         </w:rPr>
-        <w:t xml:space="preserve"> Announced on 21 September 2020 as a pandemic measure, the incentive sits in the Règles budgétaires de fonctionnement of the school service centres, now as measure 15178 in several volets. A retired teacher doing supply work is paid from the first day at the salary step and experience held at retirement, where the ordinary rules grant that step only after twenty days; the pension continues because the retiree may elect not to rejoin the plan. It was first limited to teachers retired since July 2015; a ministerial act effective in late January 2022 removed the condition, and the measure was declared permanent the same month. It rests on an agreement outside the collective agreement, between the employers' negotiating committee and the teaching unions, renewed each school year. The minister has written to retired teachers twice, in June 2023 and August 2025. The ministry's figure for 2024-25 is more than 5,000 retirees back in schools; the press has since reported that some school service centres call retirees last because they cost more.</w:t>
+        <w:t xml:space="preserve"> Since September 2020, a retired teacher in Quebec who does supply work is paid from the first day at the salary step and experience held at retirement, where the ordinary rules grant that step only after twenty days, and keeps the full pension by electing not to rejoin the plan. The incentive sits in the operating budget rules of the school service centres as measure 15178 and rests on an agreement outside the collective agreement, between the employers' negotiating committee and the teaching unions, renewed each school year. First limited to teachers retired since July 2015, it was opened to all retirees by ministerial act in January 2022 and declared permanent the same month; the minister has written to retired teachers twice, in June 2023 and August 2025. The ministry counts more than 5,000 retirees back in schools in 2024-25. What we do not know: how that figure is counted, whether the measure has been assessed, and whether, as the press reported in December 2025, some school service centres call retirees last because they cost more.</w:t>
       </w:r>
     </w:p>
     <w:p>
@@ -2118,7 +2118,7 @@
           <w:sz w:val="24"/>
           <w:szCs w:val="24"/>
         </w:rPr>
-        <w:t xml:space="preserve"> Since 2018 the Ministry of Education and the Ministry of Finance have recruited retired principals, teaching-research officers, special-grade and senior teachers, generally aged 65 or under, to county-town and rural schools in formerly poor, border and minority counties. Recruitment is run by provinces against named posts; the county education bureau signs an agreement with the teacher, for at least one school year and renewed annually, on the strength of a recent health certificate. The pension is untouched; the work is funded at 20,000 yuan per person per year, shared between central and local budgets, for an allowance, travel and accident insurance, and the county provides housing. In 2023 ten government departments extended the model to higher, vocational and private education, with a target of about 120,000 silver-age teachers within three years. The annual plan for compulsory education has been 7,000 in 2024 and 2025, and the notices ask provinces to raise their completion rate.</w:t>
+        <w:t xml:space="preserve"> The Silver-Age Lecturing Plan, run by the Ministry of Education with the Ministry of Finance since 2018, posts retired principals, teaching-research officers, special-grade and senior teachers, generally aged 65 or under, to county-town and rural schools in formerly poor, border and minority counties. Provinces recruit against named posts; the county education bureau signs a one-year agreement with the teacher, renewable, on the strength of a recent health certificate; the pension is untouched, the work is funded at 20,000 yuan per person per year for an allowance, travel and accident insurance, and the county provides housing. The plan aimed at 10,000 teachers in its first three years and at 7,000 a year in 2024 and 2025; in 2023 ten government departments extended the model to higher, vocational and private education, with a target of about 120,000 silver-age teachers within three years. What we do not know: how many have actually been recruited against those plans, since the annual notices ask provinces to raise their completion rate, how long teachers stay, and whether anyone has assessed the effect on the receiving schools.</w:t>
       </w:r>
     </w:p>
     <w:p>
@@ -2735,35 +2735,7 @@
           <w:sz w:val="24"/>
           <w:szCs w:val="24"/>
         </w:rPr>
-        <w:t xml:space="preserve"> The regulation took effect on 1 November 2017 and paid a primary-school board up to 2,500 euros for each qualified teacher it hired who had not worked in primary education for at least a year, on a contract of six months or more. The money went to the board, for the guidance and support a returner needs in the first months. The first budget was 1.25 million euros, enough for about 500 returners; a 2019 amendment extended the scheme, applications closed on 1 November 2020 and the regulation expired on 1 January</w:t>
-      </w:r>
-    </w:p>
-    <w:p>
-      <w:pPr>
-        <w:spacing w:after="60" w:before="200"/>
-        <w:ind w:left="504" w:hanging="504"/>
-      </w:pPr>
-      <w:r>
-        <w:rPr>
-          <w:rFonts w:ascii="Garamond" w:cs="Garamond" w:eastAsia="Garamond" w:hAnsi="Garamond"/>
-          <w:b/>
-          <w:bCs/>
-          <w:color w:val="000000"/>
-          <w:sz w:val="24"/>
-          <w:szCs w:val="24"/>
-        </w:rPr>
-        <w:t xml:space="preserve">2022.	</w:t>
-      </w:r>
-      <w:r>
-        <w:rPr>
-          <w:rFonts w:ascii="Garamond" w:cs="Garamond" w:eastAsia="Garamond" w:hAnsi="Garamond"/>
-          <w:b w:val="false"/>
-          <w:bCs w:val="false"/>
-          <w:color w:val="000000"/>
-          <w:sz w:val="24"/>
-          <w:szCs w:val="24"/>
-        </w:rPr>
-        <w:t xml:space="preserve">In mid-2019 the ministry reported that more than a hundred returners had used it, against a pool of qualified teachers outside education that it put in the tens of thousands. A Dutch teaching qualification does not expire, so there is no re-licensing step on the way back.</w:t>
+        <w:t xml:space="preserve"> The Regeling tegemoetkoming herintreders primair onderwijs, in force from November 2017, paid a primary-school board up to 2,500 euros for each qualified teacher it hired who had not worked in primary education for at least a year, on a contract of six months or more; the money went to the board, for the guidance and support a returner needs in the first months. A Dutch teaching qualification does not expire, so there was no re-licensing step on the way back. The first budget was 1.25 million euros, enough for about 500 returners; a 2019 amendment extended the scheme, applications closed in November 2020 and the regulation expired in January 2022. In mid-2019 the ministry reported that more than a hundred returners had used it, against a pool of qualified teachers outside education that it put in the tens of thousands. What we do not know: how much of the money was finally used, whether the returners stayed, why the scheme was allowed to lapse, and whether it was ever evaluated.</w:t>
       </w:r>
     </w:p>
     <w:p>
@@ -3365,7 +3337,7 @@
           <w:sz w:val="24"/>
           <w:szCs w:val="24"/>
         </w:rPr>
-        <w:t xml:space="preserve"> Almost every state lets a retired teacher return under conditions built from the same four levers: a waiting period, an earnings ceiling, a shortage designation the district must establish, and a limit on the duration of the return. The states in our set have moved these levers differently. Michigan cut the wait to six months and removed the earnings ceiling after it, under a law expiring in October 2028. Georgia opened full-time return only to teachers with thirty years of service, in subjects a region had designated as highest-need; its 2025 audit found a few hundred returns a year and the one-year wait, not the pay rules, as the main deterrent, and the legislature has since widened eligibility and extended the measure to 2034. New Mexico lets a retiree draw pension and full salary with no cap on earnings or hours for a limited number of months, each return approved by the retirement board. Louisiana removed the cut-off that had confined its critical-shortage route to teachers retired before mid-2020. North Carolina ran the most generous version between 1999 and 2009, and published research finds those returners went disproportionately to high-need schools; the policy was allowed to lapse. Virginia acted on the licence rather than the pension. Several of these laws were amended in 2025 and 2026; check the current text before the conversation.</w:t>
+        <w:t xml:space="preserve"> Almost every US state lets a retired teacher return to work under conditions built from four levers: a waiting period, an earnings ceiling, a shortage designation the district must establish, and a limit on the duration of the return. In the states in our set, Michigan, since October 2023, cut the wait to six months and removed the earnings ceiling after it, under a law expiring in October 2028; Georgia, from 2022, opened full-time return to teachers with thirty years of service in subjects a region designated as highest-need, and has since widened eligibility and extended the measure to 2034; New Mexico, since 2022, lets a retiree draw pension and full salary with no cap on earnings or hours for a limited number of months, each return approved by the retirement board; Louisiana, in 2024, removed the cut-off that confined its critical-shortage route to teachers retired before mid-2020; North Carolina let retirees return full-time on full salary and pension between 1999 and 2009; and Virginia, in 2022, acted on the licence rather than the pension. The numbers we have are few: Georgia's 2025 audit found a few hundred returns a year and named the one-year wait, not the pay rules, as the main deterrent, and research on North Carolina finds its returners went disproportionately to high-need schools. What we do not know: how many have returned in the other states, what the measures have cost the retirement systems, and the exact current rules, since several laws were amended in 2025 and 2026; check the text before the conversation.</w:t>
       </w:r>
     </w:p>
     <w:p>

</xml_diff>